<commit_message>
Added some parts of documentation
</commit_message>
<xml_diff>
--- a/docs/DSW Project Documentation (1).docx
+++ b/docs/DSW Project Documentation (1).docx
@@ -10837,9 +10837,9 @@
           <w:noProof/>
         </w:rPr>
         <w:drawing>
-          <wp:inline distT="0" distB="0" distL="0" distR="0" wp14:anchorId="4DD408FF" wp14:editId="4B1CB4E9">
-            <wp:extent cx="5744845" cy="5153629"/>
-            <wp:effectExtent l="0" t="0" r="8255" b="9525"/>
+          <wp:inline distT="0" distB="0" distL="0" distR="0" wp14:anchorId="4DD408FF" wp14:editId="20AB0AC0">
+            <wp:extent cx="5797550" cy="5715000"/>
+            <wp:effectExtent l="0" t="0" r="0" b="0"/>
             <wp:docPr id="738535750" name="Picture 6"/>
             <wp:cNvGraphicFramePr>
               <a:graphicFrameLocks xmlns:a="http://schemas.openxmlformats.org/drawingml/2006/main" noChangeAspect="1"/>
@@ -10866,7 +10866,7 @@
                   <pic:spPr>
                     <a:xfrm>
                       <a:off x="0" y="0"/>
-                      <a:ext cx="5767682" cy="5174115"/>
+                      <a:ext cx="5841193" cy="5758022"/>
                     </a:xfrm>
                     <a:prstGeom prst="rect">
                       <a:avLst/>
@@ -10884,6 +10884,7 @@
         <w:pStyle w:val="Heading2"/>
       </w:pPr>
       <w:r>
+        <w:lastRenderedPageBreak/>
         <w:t>U</w:t>
       </w:r>
       <w:r>
@@ -10930,7 +10931,6 @@
         </w:numPr>
       </w:pPr>
       <w:r>
-        <w:lastRenderedPageBreak/>
         <w:t>Income board (chart + table)</w:t>
       </w:r>
     </w:p>

</xml_diff>